<commit_message>
Publish a lite résumé without email or city
The public .docx and .pdf now give LinkedIn and the site as the ways to get
in touch; email and city are gone from them (the phone already was). Both
are clickable links in both files. The full résumé stays private, to send
directly.

Co-Authored-By: Claude Opus 5.5 <noreply@anthropic.com>
</commit_message>
<xml_diff>
--- a/public/Mani_Karthik_Resume.docx
+++ b/public/Mani_Karthik_Resume.docx
@@ -56,6 +56,19 @@
         <w:spacing w:after="200" w:before="0" w:lineRule="auto"/>
         <w:rPr/>
       </w:pPr>
+      <w:hyperlink r:id="rId11">
+        <w:r>
+          <w:rPr>
+            <w:rFonts w:ascii="Arial" w:cs="Arial" w:eastAsia="Arial" w:hAnsi="Arial"/>
+            <w:color w:val="2e75b6"/>
+            <w:sz w:val="19"/>
+            <w:szCs w:val="19"/>
+            <w:u w:val="single"/>
+            <w:rtl w:val="0"/>
+          </w:rPr>
+          <w:t xml:space="preserve">linkedin.com/in/mani-karthik-bollimuntha-b30268b7</w:t>
+        </w:r>
+      </w:hyperlink>
       <w:r>
         <w:rPr>
           <w:rFonts w:ascii="Arial" w:cs="Arial" w:eastAsia="Arial" w:hAnsi="Arial"/>
@@ -64,7 +77,7 @@
           <w:szCs w:val="19"/>
           <w:rtl w:val="0"/>
         </w:rPr>
-        <w:t xml:space="preserve">Herndon, VA  •  manikarthik@live.com  •  </w:t>
+        <w:t xml:space="preserve">  •  </w:t>
       </w:r>
       <w:hyperlink r:id="rId7">
         <w:r>

</xml_diff>